<commit_message>
Refresh Enrollment QA-893 handoff pack and coverage for nmdirect CI inclusion
- Update all QA-893 Enrollment deliverables and markdown guides to reflect that regression/integration XML now runs okdirect + newyork + nmdirect.
- Refresh coverage CSV, status markdown, sign-off docs, and the generator script to mark nmdirect as included in current suites and remove the deferred nmdirect CI follow-up item.
- Tighten setup/troubleshooting guidance: JDK/Maven versions, canonical GitLab repo references, approved BFF routes, Oracle relay/personal overlay language, and warnings about unverified GitLab nightly jobs.
- Update SharePoint Copilot prompts and publish checklist with platform diagram, program accomplishment metrics, and stricter diagram/DoD validation rules.
- Remove stray Word lock file from the Sep 25 leadership update deliverables.
</commit_message>
<xml_diff>
--- a/programs/unite-msc/enrollment/deliverables/Enrollment-AI-Scenario-Guide.docx
+++ b/programs/unite-msc/enrollment/deliverables/Enrollment-AI-Scenario-Guide.docx
@@ -62,7 +62,7 @@
           <w:color w:val="616161"/>
           <w:sz w:val="22"/>
         </w:rPr>
-        <w:t>September 14, 2026  ·  QA Automation (AMSQUAD)  ·  QA-893</w:t>
+        <w:t>September 24, 2026  ·  QA Automation (AMSQUAD)  ·  QA-893</w:t>
       </w:r>
     </w:p>
     <w:p>
@@ -109,7 +109,7 @@
           <w:color w:val="616161"/>
           <w:sz w:val="22"/>
         </w:rPr>
-        <w:t>Clone OwnerEnteredTests (or similar). Extend EnrollmentBaseTest. Same TestNG groups. Wire regression + integration XML for okdirect and newyork only.</w:t>
+        <w:t>Clone the nearest step. Extend EnrollmentBaseTest. Preserve groups and ordered state. Wire regression, integration, and localhost XML for every intended branding block.</w:t>
       </w:r>
     </w:p>
     <w:p>
@@ -151,7 +151,7 @@
                 <w:color w:val="003057"/>
                 <w:sz w:val="22"/>
               </w:rPr>
-              <w:t>Do not put passwords, JWT, or SSN in the prompt. Attach stripped Postman or plain payloads from msc-enrollment/postman/payloads/plain/.</w:t>
+              <w:t>Do not put passwords, JWT, or SSN in the prompt. Attach stripped Postman from GitLab api-test-automation (no secrets).</w:t>
             </w:r>
           </w:p>
         </w:tc>
@@ -229,7 +229,7 @@
         <w:color w:val="616161"/>
         <w:sz w:val="16"/>
       </w:rPr>
-      <w:t>QA Automation AMSQUAD  ·  September 14, 2026  ·  No credentials</w:t>
+      <w:t>QA Automation AMSQUAD  ·  September 24, 2026  ·  No credentials</w:t>
     </w:r>
   </w:p>
   <w:p>

</xml_diff>